<commit_message>
Update Soomin Park - Cover Letter 2025.docx
</commit_message>
<xml_diff>
--- a/public/Soomin Park - Cover Letter 2025.docx
+++ b/public/Soomin Park - Cover Letter 2025.docx
@@ -32,17 +32,6 @@
     </w:p>
     <w:p>
       <w:pPr>
-        <w:jc w:val="center"/>
-      </w:pPr>
-      <w:r>
-        <w:t>Link to portfolio</w:t>
-      </w:r>
-      <w:r>
-        <w:t xml:space="preserve">: </w:t>
-      </w:r>
-    </w:p>
-    <w:p>
-      <w:pPr>
         <w:spacing w:after="240"/>
       </w:pPr>
       <w:r>
@@ -62,13 +51,7 @@
         <w:spacing w:after="240"/>
       </w:pPr>
       <w:r>
-        <w:t>I've always been interested in IT, but spent several years in the trucking industry in Canada. After realizing I wanted to pursue my true passion, I left trucking to study computer software development. Since I didn't have a Canadian academic background, I completed Open Studies at NAIT with high grades, earned acceptance into the Digital Media and IT program in Spring 2024, and have maintained a top</w:t>
-      </w:r>
-      <w:r>
-        <w:t xml:space="preserve"> </w:t>
-      </w:r>
-      <w:r>
-        <w:t>tier GPA since.</w:t>
+        <w:t>I've always been interested in IT, but spent several years in the trucking industry in Canada. After realizing I wanted to pursue my true passion, I left trucking to study computer software development. Since I didn't have a Canadian academic background, I completed Open Studies at NAIT with high grades, earned acceptance into the Digital Media and IT program in Spring 2024, and have maintained a top tier GPA since.</w:t>
       </w:r>
     </w:p>
     <w:p>
@@ -84,31 +67,7 @@
         <w:spacing w:after="240"/>
       </w:pPr>
       <w:r>
-        <w:t>I don't just mean planning</w:t>
-      </w:r>
-      <w:r>
-        <w:t xml:space="preserve">, </w:t>
-      </w:r>
-      <w:r>
-        <w:t xml:space="preserve">I mean understanding what truly matters before deciding how to build it. When approaching any task, I ask: What's the real problem? What's the #1 priority that cannot fail? </w:t>
-      </w:r>
-      <w:r>
-        <w:t>I think t</w:t>
-      </w:r>
-      <w:r>
-        <w:t>his development sense</w:t>
-      </w:r>
-      <w:r>
-        <w:t xml:space="preserve">, </w:t>
-      </w:r>
-      <w:r>
-        <w:t>identifying which problems are worth solving and finding the simplest way to deliver value</w:t>
-      </w:r>
-      <w:r>
-        <w:t xml:space="preserve">, </w:t>
-      </w:r>
-      <w:r>
-        <w:t>is what sets developers apart.</w:t>
+        <w:t>I don't just mean planning, I mean understanding what truly matters before deciding how to build it. When approaching any task, I ask: What's the real problem? What's the #1 priority that cannot fail? I think this development sense, identifying which problems are worth solving and finding the simplest way to deliver value, is what sets developers apart.</w:t>
       </w:r>
     </w:p>
     <w:p>
@@ -124,33 +83,7 @@
         <w:spacing w:after="240"/>
       </w:pPr>
       <w:r>
-        <w:t xml:space="preserve">I understand </w:t>
-      </w:r>
-      <w:proofErr w:type="spellStart"/>
-      <w:r>
-        <w:t>trade</w:t>
-      </w:r>
-      <w:r>
-        <w:t xml:space="preserve"> </w:t>
-      </w:r>
-      <w:r>
-        <w:t>offs</w:t>
-      </w:r>
-      <w:proofErr w:type="spellEnd"/>
-      <w:r>
-        <w:t>. Every technical choice has costs</w:t>
-      </w:r>
-      <w:r>
-        <w:t>. D</w:t>
-      </w:r>
-      <w:r>
-        <w:t xml:space="preserve">evelopment time, complexity, </w:t>
-      </w:r>
-      <w:r>
-        <w:t xml:space="preserve">and </w:t>
-      </w:r>
-      <w:r>
-        <w:t>maintenance burden. I won't chase elegant architectures or trendy frameworks just because they're impressive. I choose solutions that solve real problems efficiently.</w:t>
+        <w:t>I understand trade offs. Every technical choice has costs. Development time, complexity, and maintenance burden. I won't chase elegant architectures or trendy frameworks just because they're impressive. I choose solutions that solve real problems efficiently.</w:t>
       </w:r>
     </w:p>
     <w:p>
@@ -158,13 +91,7 @@
         <w:spacing w:after="240"/>
       </w:pPr>
       <w:r>
-        <w:t xml:space="preserve">I think critically, looking for what others might miss and identifying potential issues before they become problems. I'm eager to learn from successful products, failure </w:t>
-      </w:r>
-      <w:r>
-        <w:t>cases</w:t>
-      </w:r>
-      <w:r>
-        <w:t>, and teammates with different perspectives.</w:t>
+        <w:t>I think critically, looking for what others might miss and identifying potential issues before they become problems. I'm eager to learn from successful products, failure cases, and teammates with different perspectives.</w:t>
       </w:r>
     </w:p>
     <w:p>

</xml_diff>